<commit_message>
Rules: send journal/change log unprompted; docs: Operations read-me, new automations, outside-the-site
Co-Authored-By: Claude Fable 5.1 <noreply@anthropic.com>
Claude-Session: https://claude.ai/code/session_01JPZJaTbXQFN2qiYRf4rkZK
</commit_message>
<xml_diff>
--- a/docs/Next_Owner_Market_Complete_Guide.docx
+++ b/docs/Next_Owner_Market_Complete_Guide.docx
@@ -2,7 +2,7 @@
 <file path=word/document.xml><?xml version="1.0" encoding="utf-8"?>
 <w:document xmlns:w="http://schemas.openxmlformats.org/wordprocessingml/2006/main" xmlns:m="http://schemas.openxmlformats.org/officeDocument/2006/math" xmlns:r="http://schemas.openxmlformats.org/officeDocument/2006/relationships" xmlns:o="urn:schemas-microsoft-com:office:office" xmlns:v="urn:schemas-microsoft-com:vml" xmlns:w10="urn:schemas-microsoft-com:office:word" xmlns:a="http://schemas.openxmlformats.org/drawingml/2006/main" xmlns:pic="http://schemas.openxmlformats.org/drawingml/2006/picture" xmlns:wp="http://schemas.openxmlformats.org/drawingml/2006/wordprocessingDrawing">
   <w:body>
-    <w:bookmarkStart w:id="48" w:name="next-owner-market--the-complete-guide"/>
+    <w:bookmarkStart w:id="49" w:name="next-owner-market--the-complete-guide"/>
     <w:p>
       <w:pPr>
         <w:pStyle w:val="Heading1"/>
@@ -1870,31 +1870,31 @@
               <w:jc w:val="left"/>
             </w:pPr>
             <w:r>
-              <w:t xml:space="preserve">Held-money timers</w:t>
-            </w:r>
-          </w:p>
-        </w:tc>
-        <w:tc>
-          <w:tcPr/>
-          <w:p>
-            <w:pPr>
-              <w:pStyle w:val="Compact"/>
-              <w:jc w:val="left"/>
-            </w:pPr>
-            <w:r>
-              <w:t xml:space="preserve">Release 3 days after delivery; refund pickup orders not completed in 7 days; apply referral credits</w:t>
-            </w:r>
-          </w:p>
-        </w:tc>
-        <w:tc>
-          <w:tcPr/>
-          <w:p>
-            <w:pPr>
-              <w:pStyle w:val="Compact"/>
-              <w:jc w:val="left"/>
-            </w:pPr>
-            <w:r>
-              <w:t xml:space="preserve">Money never gets stuck</w:t>
+              <w:t xml:space="preserve">Health check</w:t>
+            </w:r>
+          </w:p>
+        </w:tc>
+        <w:tc>
+          <w:tcPr/>
+          <w:p>
+            <w:pPr>
+              <w:pStyle w:val="Compact"/>
+              <w:jc w:val="left"/>
+            </w:pPr>
+            <w:r>
+              <w:t xml:space="preserve">Tests Stripe, email, AI, Shippo, Facebook, sitemap, Google feed, IndexNow every morning; marks each OK/broken on Operations; emails staff if something that worked breaks</w:t>
+            </w:r>
+          </w:p>
+        </w:tc>
+        <w:tc>
+          <w:tcPr/>
+          <w:p>
+            <w:pPr>
+              <w:pStyle w:val="Compact"/>
+              <w:jc w:val="left"/>
+            </w:pPr>
+            <w:r>
+              <w:t xml:space="preserve">Nobody finds out from a customer</w:t>
             </w:r>
           </w:p>
         </w:tc>
@@ -1908,31 +1908,31 @@
               <w:jc w:val="left"/>
             </w:pPr>
             <w:r>
-              <w:t xml:space="preserve">Welcome series</w:t>
-            </w:r>
-          </w:p>
-        </w:tc>
-        <w:tc>
-          <w:tcPr/>
-          <w:p>
-            <w:pPr>
-              <w:pStyle w:val="Compact"/>
-              <w:jc w:val="left"/>
-            </w:pPr>
-            <w:r>
-              <w:t xml:space="preserve">Day 1 "start with one box," day 3 "what's your first item worth," day 7 nudge; each once, only if they haven't done it</w:t>
-            </w:r>
-          </w:p>
-        </w:tc>
-        <w:tc>
-          <w:tcPr/>
-          <w:p>
-            <w:pPr>
-              <w:pStyle w:val="Compact"/>
-              <w:jc w:val="left"/>
-            </w:pPr>
-            <w:r>
-              <w:t xml:space="preserve">Turns sign-ups into sellers</w:t>
+              <w:t xml:space="preserve">Held-money timers</w:t>
+            </w:r>
+          </w:p>
+        </w:tc>
+        <w:tc>
+          <w:tcPr/>
+          <w:p>
+            <w:pPr>
+              <w:pStyle w:val="Compact"/>
+              <w:jc w:val="left"/>
+            </w:pPr>
+            <w:r>
+              <w:t xml:space="preserve">Release 3 days after delivery; refund pickup orders not completed in 7 days; apply referral credits</w:t>
+            </w:r>
+          </w:p>
+        </w:tc>
+        <w:tc>
+          <w:tcPr/>
+          <w:p>
+            <w:pPr>
+              <w:pStyle w:val="Compact"/>
+              <w:jc w:val="left"/>
+            </w:pPr>
+            <w:r>
+              <w:t xml:space="preserve">Money never gets stuck</w:t>
             </w:r>
           </w:p>
         </w:tc>
@@ -1946,31 +1946,31 @@
               <w:jc w:val="left"/>
             </w:pPr>
             <w:r>
-              <w:t xml:space="preserve">Seller nudges</w:t>
-            </w:r>
-          </w:p>
-        </w:tc>
-        <w:tc>
-          <w:tcPr/>
-          <w:p>
-            <w:pPr>
-              <w:pStyle w:val="Compact"/>
-              <w:jc w:val="left"/>
-            </w:pPr>
-            <w:r>
-              <w:t xml:space="preserve">Views-no-messages → suggest price drop; 3+ saves; drafts sitting 3+ days; live listing but no payouts</w:t>
-            </w:r>
-          </w:p>
-        </w:tc>
-        <w:tc>
-          <w:tcPr/>
-          <w:p>
-            <w:pPr>
-              <w:pStyle w:val="Compact"/>
-              <w:jc w:val="left"/>
-            </w:pPr>
-            <w:r>
-              <w:t xml:space="preserve">Each is a reason to act</w:t>
+              <w:t xml:space="preserve">Welcome series</w:t>
+            </w:r>
+          </w:p>
+        </w:tc>
+        <w:tc>
+          <w:tcPr/>
+          <w:p>
+            <w:pPr>
+              <w:pStyle w:val="Compact"/>
+              <w:jc w:val="left"/>
+            </w:pPr>
+            <w:r>
+              <w:t xml:space="preserve">Day 1 "start with one box," day 3 "what's your first item worth," day 7 nudge; each once, only if they haven't done it</w:t>
+            </w:r>
+          </w:p>
+        </w:tc>
+        <w:tc>
+          <w:tcPr/>
+          <w:p>
+            <w:pPr>
+              <w:pStyle w:val="Compact"/>
+              <w:jc w:val="left"/>
+            </w:pPr>
+            <w:r>
+              <w:t xml:space="preserve">Turns sign-ups into sellers</w:t>
             </w:r>
           </w:p>
         </w:tc>
@@ -1984,6 +1984,44 @@
               <w:jc w:val="left"/>
             </w:pPr>
             <w:r>
+              <w:t xml:space="preserve">Seller nudges</w:t>
+            </w:r>
+          </w:p>
+        </w:tc>
+        <w:tc>
+          <w:tcPr/>
+          <w:p>
+            <w:pPr>
+              <w:pStyle w:val="Compact"/>
+              <w:jc w:val="left"/>
+            </w:pPr>
+            <w:r>
+              <w:t xml:space="preserve">Views-no-messages → suggest price drop; 3+ saves; drafts sitting 3+ days; live listing but no payouts</w:t>
+            </w:r>
+          </w:p>
+        </w:tc>
+        <w:tc>
+          <w:tcPr/>
+          <w:p>
+            <w:pPr>
+              <w:pStyle w:val="Compact"/>
+              <w:jc w:val="left"/>
+            </w:pPr>
+            <w:r>
+              <w:t xml:space="preserve">Each is a reason to act</w:t>
+            </w:r>
+          </w:p>
+        </w:tc>
+      </w:tr>
+      <w:tr>
+        <w:tc>
+          <w:tcPr/>
+          <w:p>
+            <w:pPr>
+              <w:pStyle w:val="Compact"/>
+              <w:jc w:val="left"/>
+            </w:pPr>
+            <w:r>
               <w:t xml:space="preserve">Milestones</w:t>
             </w:r>
           </w:p>
@@ -2000,6 +2038,20 @@
             </w:r>
             <w:r>
               <w:t xml:space="preserve"> </w:t>
+            </w:r>
+            <m:oMath>
+              <m:r>
+                <m:t>25</m:t>
+              </m:r>
+              <m:r>
+                <m:rPr>
+                  <m:sty m:val="p"/>
+                </m:rPr>
+                <m:t>/</m:t>
+              </m:r>
+            </m:oMath>
+            <w:r>
+              <w:t xml:space="preserve">50/</w:t>
             </w:r>
             <m:oMath>
               <m:r>
@@ -2013,19 +2065,209 @@
               </m:r>
             </m:oMath>
             <w:r>
-              <w:t xml:space="preserve">500/$1,000 sold; each once, with a paste-able share line</w:t>
-            </w:r>
-          </w:p>
-        </w:tc>
-        <w:tc>
-          <w:tcPr/>
-          <w:p>
-            <w:pPr>
-              <w:pStyle w:val="Compact"/>
-              <w:jc w:val="left"/>
-            </w:pPr>
-            <w:r>
-              <w:t xml:space="preserve">Wins get shared</w:t>
+              <w:t xml:space="preserve">500/$1,000 sold; each once, with a paste-able share line and the referral link; a text too if they turned texts on</w:t>
+            </w:r>
+          </w:p>
+        </w:tc>
+        <w:tc>
+          <w:tcPr/>
+          <w:p>
+            <w:pPr>
+              <w:pStyle w:val="Compact"/>
+              <w:jc w:val="left"/>
+            </w:pPr>
+            <w:r>
+              <w:t xml:space="preserve">Wins get shared; small sellers feel it early</w:t>
+            </w:r>
+          </w:p>
+        </w:tc>
+      </w:tr>
+      <w:tr>
+        <w:tc>
+          <w:tcPr/>
+          <w:p>
+            <w:pPr>
+              <w:pStyle w:val="Compact"/>
+              <w:jc w:val="left"/>
+            </w:pPr>
+            <w:r>
+              <w:t xml:space="preserve">Buyer weekly digest</w:t>
+            </w:r>
+          </w:p>
+        </w:tc>
+        <w:tc>
+          <w:tcPr/>
+          <w:p>
+            <w:pPr>
+              <w:pStyle w:val="Compact"/>
+              <w:jc w:val="left"/>
+            </w:pPr>
+            <w:r>
+              <w:t xml:space="preserve">Thursdays: every account with a ZIP gets the newest items within 100 miles</w:t>
+            </w:r>
+          </w:p>
+        </w:tc>
+        <w:tc>
+          <w:tcPr/>
+          <w:p>
+            <w:pPr>
+              <w:pStyle w:val="Compact"/>
+              <w:jc w:val="left"/>
+            </w:pPr>
+            <w:r>
+              <w:t xml:space="preserve">Buyers come back for the weekend</w:t>
+            </w:r>
+          </w:p>
+        </w:tc>
+      </w:tr>
+      <w:tr>
+        <w:tc>
+          <w:tcPr/>
+          <w:p>
+            <w:pPr>
+              <w:pStyle w:val="Compact"/>
+              <w:jc w:val="left"/>
+            </w:pPr>
+            <w:r>
+              <w:t xml:space="preserve">Seller weekly report</w:t>
+            </w:r>
+          </w:p>
+        </w:tc>
+        <w:tc>
+          <w:tcPr/>
+          <w:p>
+            <w:pPr>
+              <w:pStyle w:val="Compact"/>
+              <w:jc w:val="left"/>
+            </w:pPr>
+            <w:r>
+              <w:t xml:space="preserve">Mondays: views, saves, messages, offers, sales, and the one thing to do next</w:t>
+            </w:r>
+          </w:p>
+        </w:tc>
+        <w:tc>
+          <w:tcPr/>
+          <w:p>
+            <w:pPr>
+              <w:pStyle w:val="Compact"/>
+              <w:jc w:val="left"/>
+            </w:pPr>
+            <w:r>
+              <w:t xml:space="preserve">The habit loop</w:t>
+            </w:r>
+          </w:p>
+        </w:tc>
+      </w:tr>
+      <w:tr>
+        <w:tc>
+          <w:tcPr/>
+          <w:p>
+            <w:pPr>
+              <w:pStyle w:val="Compact"/>
+              <w:jc w:val="left"/>
+            </w:pPr>
+            <w:r>
+              <w:t xml:space="preserve">Win-back + Pro offer</w:t>
+            </w:r>
+          </w:p>
+        </w:tc>
+        <w:tc>
+          <w:tcPr/>
+          <w:p>
+            <w:pPr>
+              <w:pStyle w:val="Compact"/>
+              <w:jc w:val="left"/>
+            </w:pPr>
+            <w:r>
+              <w:t xml:space="preserve">30 days quiet → one note; free credits hit zero → one plain explanation of Pro</w:t>
+            </w:r>
+          </w:p>
+        </w:tc>
+        <w:tc>
+          <w:tcPr/>
+          <w:p>
+            <w:pPr>
+              <w:pStyle w:val="Compact"/>
+              <w:jc w:val="left"/>
+            </w:pPr>
+            <w:r>
+              <w:t xml:space="preserve">Cheapest users to bring back; the right moment to upsell</w:t>
+            </w:r>
+          </w:p>
+        </w:tc>
+      </w:tr>
+      <w:tr>
+        <w:tc>
+          <w:tcPr/>
+          <w:p>
+            <w:pPr>
+              <w:pStyle w:val="Compact"/>
+              <w:jc w:val="left"/>
+            </w:pPr>
+            <w:r>
+              <w:t xml:space="preserve">Facebook Page</w:t>
+            </w:r>
+          </w:p>
+        </w:tc>
+        <w:tc>
+          <w:tcPr/>
+          <w:p>
+            <w:pPr>
+              <w:pStyle w:val="Compact"/>
+              <w:jc w:val="left"/>
+            </w:pPr>
+            <w:r>
+              <w:t xml:space="preserve">With a Page token: up to 3 new items a day and each weekly post, posted to the Page</w:t>
+            </w:r>
+          </w:p>
+        </w:tc>
+        <w:tc>
+          <w:tcPr/>
+          <w:p>
+            <w:pPr>
+              <w:pStyle w:val="Compact"/>
+              <w:jc w:val="left"/>
+            </w:pPr>
+            <w:r>
+              <w:t xml:space="preserve">Posting by hand stops; this doesn't</w:t>
+            </w:r>
+          </w:p>
+        </w:tc>
+      </w:tr>
+      <w:tr>
+        <w:tc>
+          <w:tcPr/>
+          <w:p>
+            <w:pPr>
+              <w:pStyle w:val="Compact"/>
+              <w:jc w:val="left"/>
+            </w:pPr>
+            <w:r>
+              <w:t xml:space="preserve">Staff weekly digest</w:t>
+            </w:r>
+          </w:p>
+        </w:tc>
+        <w:tc>
+          <w:tcPr/>
+          <w:p>
+            <w:pPr>
+              <w:pStyle w:val="Compact"/>
+              <w:jc w:val="left"/>
+            </w:pPr>
+            <w:r>
+              <w:t xml:space="preserve">Mondays: numbers, what ran, what's broken, human tasks due, in one email</w:t>
+            </w:r>
+          </w:p>
+        </w:tc>
+        <w:tc>
+          <w:tcPr/>
+          <w:p>
+            <w:pPr>
+              <w:pStyle w:val="Compact"/>
+              <w:jc w:val="left"/>
+            </w:pPr>
+            <w:r>
+              <w:t xml:space="preserve">Nobody has to remember to look</w:t>
             </w:r>
           </w:p>
         </w:tc>
@@ -2283,7 +2525,7 @@
       </w:r>
     </w:p>
     <w:bookmarkEnd w:id="43"/>
-    <w:bookmarkStart w:id="44" w:name="part-5--how-it-grows-the-flywheel"/>
+    <w:bookmarkStart w:id="45" w:name="part-5--how-it-grows-the-flywheel"/>
     <w:p>
       <w:pPr>
         <w:pStyle w:val="Heading2"/>
@@ -2422,6 +2664,156 @@
       </w:r>
       <w:r>
         <w:t xml:space="preserve">Pro for the tools, commission on sales. Both scale with the loop above.</w:t>
+      </w:r>
+    </w:p>
+    <w:bookmarkStart w:id="44" w:name="Xc81d844fb4d3dc3978ef762a384954996cd363e"/>
+    <w:p>
+      <w:pPr>
+        <w:pStyle w:val="Heading3"/>
+      </w:pPr>
+      <w:r>
+        <w:t xml:space="preserve">The Operations page (nextownermarket.com/app/ops)</w:t>
+      </w:r>
+    </w:p>
+    <w:p>
+      <w:pPr>
+        <w:pStyle w:val="FirstParagraph"/>
+      </w:pPr>
+      <w:r>
+        <w:t xml:space="preserve">The control room, written so a brand-new hire can run the business from it. Top to bottom:</w:t>
+      </w:r>
+    </w:p>
+    <w:p>
+      <w:pPr>
+        <w:numPr>
+          <w:ilvl w:val="0"/>
+          <w:numId w:val="1023"/>
+        </w:numPr>
+        <w:pStyle w:val="Compact"/>
+      </w:pPr>
+      <w:r>
+        <w:rPr>
+          <w:bCs/>
+          <w:b/>
+        </w:rPr>
+        <w:t xml:space="preserve">Read me first</w:t>
+      </w:r>
+      <w:r>
+        <w:t xml:space="preserve">: what the business is, what this page is, the weekly routine (Monday: digest + Review + People + Problems; Thursday: New Arrivals email; any day: three Facebook groups, reports), and what to do if something looks wrong (write down what you see, tell Claude, switch the automation off meanwhile).</w:t>
+      </w:r>
+    </w:p>
+    <w:p>
+      <w:pPr>
+        <w:numPr>
+          <w:ilvl w:val="0"/>
+          <w:numId w:val="1023"/>
+        </w:numPr>
+        <w:pStyle w:val="Compact"/>
+      </w:pPr>
+      <w:r>
+        <w:rPr>
+          <w:bCs/>
+          <w:b/>
+        </w:rPr>
+        <w:t xml:space="preserve">The numbers</w:t>
+      </w:r>
+      <w:r>
+        <w:t xml:space="preserve">: 28 figures (accounts, new this week, sellers, sellers with payouts, Pro, paying Pro, items live, listed this week, drafts, waiting for approval, orders, sold all time and 30 days, our cut, problems, public valuations, piles sorted, buy-or-pass checks, blog posts, community posts, reports, subscribers, automatic emails, views, saves, invites). Tap any number for a one-line meaning.</w:t>
+      </w:r>
+    </w:p>
+    <w:p>
+      <w:pPr>
+        <w:numPr>
+          <w:ilvl w:val="0"/>
+          <w:numId w:val="1023"/>
+        </w:numPr>
+        <w:pStyle w:val="Compact"/>
+      </w:pPr>
+      <w:r>
+        <w:rPr>
+          <w:bCs/>
+          <w:b/>
+        </w:rPr>
+        <w:t xml:space="preserve">What runs by itself</w:t>
+      </w:r>
+      <w:r>
+        <w:t xml:space="preserve">: every automation above, with what it does, why, how often, how many times it has run, when last, the plain result, an on/off switch, and ▶ Run now. Plus the automatic emails sent this week by type, the latest posts, and a list of the things that run with nothing to switch (sitemap, feed, pings, share images, hub/city pages, price-drop emails, staff alerts, backups).</w:t>
+      </w:r>
+    </w:p>
+    <w:p>
+      <w:pPr>
+        <w:numPr>
+          <w:ilvl w:val="0"/>
+          <w:numId w:val="1023"/>
+        </w:numPr>
+        <w:pStyle w:val="Compact"/>
+      </w:pPr>
+      <w:r>
+        <w:rPr>
+          <w:bCs/>
+          <w:b/>
+        </w:rPr>
+        <w:t xml:space="preserve">Outside the site</w:t>
+      </w:r>
+      <w:r>
+        <w:t xml:space="preserve">: every other company or service we depend on (Vercel, Supabase, GitHub, Stripe, Resend, Anthropic, Shippo, Google Search Console, Merchant Center, Business Profile, Bing/IndexNow, sitemap, Google feed, Facebook Page, Reddit, Product Hunt, creators). For each: what it is, what the site does there automatically, what a person does, who holds the login, a link, and a live status (OK / broken / human-run / not set up) from the morning health check.</w:t>
+      </w:r>
+    </w:p>
+    <w:p>
+      <w:pPr>
+        <w:numPr>
+          <w:ilvl w:val="0"/>
+          <w:numId w:val="1023"/>
+        </w:numPr>
+        <w:pStyle w:val="Compact"/>
+      </w:pPr>
+      <w:r>
+        <w:rPr>
+          <w:bCs/>
+          <w:b/>
+        </w:rPr>
+        <w:t xml:space="preserve">What customers receive, word for word</w:t>
+      </w:r>
+      <w:r>
+        <w:t xml:space="preserve">: every automatic email, when it goes, subject and body.</w:t>
+      </w:r>
+    </w:p>
+    <w:p>
+      <w:pPr>
+        <w:numPr>
+          <w:ilvl w:val="0"/>
+          <w:numId w:val="1023"/>
+        </w:numPr>
+        <w:pStyle w:val="Compact"/>
+      </w:pPr>
+      <w:r>
+        <w:rPr>
+          <w:bCs/>
+          <w:b/>
+        </w:rPr>
+        <w:t xml:space="preserve">What a person still has to do</w:t>
+      </w:r>
+      <w:r>
+        <w:t xml:space="preserve">: grouped Search / Marketing / Money / Trust / Weekly, each with what, why, exact numbered steps, a link, a notes box for the next person, and a done tick (one-time tasks fade when done; weekly/monthly ones come back).</w:t>
+      </w:r>
+    </w:p>
+    <w:p>
+      <w:pPr>
+        <w:numPr>
+          <w:ilvl w:val="0"/>
+          <w:numId w:val="1023"/>
+        </w:numPr>
+        <w:pStyle w:val="Compact"/>
+      </w:pPr>
+      <w:r>
+        <w:rPr>
+          <w:bCs/>
+          <w:b/>
+        </w:rPr>
+        <w:t xml:space="preserve">Words</w:t>
+      </w:r>
+      <w:r>
+        <w:t xml:space="preserve">: a glossary.</w:t>
       </w:r>
     </w:p>
     <w:p>
@@ -2440,7 +2832,8 @@
       </w:r>
     </w:p>
     <w:bookmarkEnd w:id="44"/>
-    <w:bookmarkStart w:id="45" w:name="X94ee665c8c315843d3c3f65cb6f5d339784bba3"/>
+    <w:bookmarkEnd w:id="45"/>
+    <w:bookmarkStart w:id="46" w:name="X94ee665c8c315843d3c3f65cb6f5d339784bba3"/>
     <w:p>
       <w:pPr>
         <w:pStyle w:val="Heading2"/>
@@ -2453,7 +2846,7 @@
       <w:pPr>
         <w:numPr>
           <w:ilvl w:val="0"/>
-          <w:numId w:val="1023"/>
+          <w:numId w:val="1024"/>
         </w:numPr>
         <w:pStyle w:val="Compact"/>
       </w:pPr>
@@ -2465,7 +2858,7 @@
       <w:pPr>
         <w:numPr>
           <w:ilvl w:val="0"/>
-          <w:numId w:val="1023"/>
+          <w:numId w:val="1024"/>
         </w:numPr>
         <w:pStyle w:val="Compact"/>
       </w:pPr>
@@ -2477,7 +2870,7 @@
       <w:pPr>
         <w:numPr>
           <w:ilvl w:val="0"/>
-          <w:numId w:val="1023"/>
+          <w:numId w:val="1024"/>
         </w:numPr>
         <w:pStyle w:val="Compact"/>
       </w:pPr>
@@ -2489,7 +2882,7 @@
       <w:pPr>
         <w:numPr>
           <w:ilvl w:val="0"/>
-          <w:numId w:val="1023"/>
+          <w:numId w:val="1024"/>
         </w:numPr>
         <w:pStyle w:val="Compact"/>
       </w:pPr>
@@ -2501,7 +2894,7 @@
       <w:pPr>
         <w:numPr>
           <w:ilvl w:val="0"/>
-          <w:numId w:val="1023"/>
+          <w:numId w:val="1024"/>
         </w:numPr>
         <w:pStyle w:val="Compact"/>
       </w:pPr>
@@ -2513,7 +2906,7 @@
       <w:pPr>
         <w:numPr>
           <w:ilvl w:val="0"/>
-          <w:numId w:val="1023"/>
+          <w:numId w:val="1024"/>
         </w:numPr>
         <w:pStyle w:val="Compact"/>
       </w:pPr>
@@ -2525,7 +2918,7 @@
       <w:pPr>
         <w:numPr>
           <w:ilvl w:val="0"/>
-          <w:numId w:val="1023"/>
+          <w:numId w:val="1024"/>
         </w:numPr>
         <w:pStyle w:val="Compact"/>
       </w:pPr>
@@ -2537,7 +2930,7 @@
       <w:pPr>
         <w:numPr>
           <w:ilvl w:val="0"/>
-          <w:numId w:val="1023"/>
+          <w:numId w:val="1024"/>
         </w:numPr>
         <w:pStyle w:val="Compact"/>
       </w:pPr>
@@ -2552,8 +2945,8 @@
         </w:pict>
       </w:r>
     </w:p>
-    <w:bookmarkEnd w:id="45"/>
-    <w:bookmarkStart w:id="46" w:name="part-7--what-it-costs-to-run"/>
+    <w:bookmarkEnd w:id="46"/>
+    <w:bookmarkStart w:id="47" w:name="part-7--what-it-costs-to-run"/>
     <w:p>
       <w:pPr>
         <w:pStyle w:val="Heading2"/>
@@ -2577,8 +2970,8 @@
         </w:pict>
       </w:r>
     </w:p>
-    <w:bookmarkEnd w:id="46"/>
-    <w:bookmarkStart w:id="47" w:name="part-8--where-everything-is-kept"/>
+    <w:bookmarkEnd w:id="47"/>
+    <w:bookmarkStart w:id="48" w:name="part-8--where-everything-is-kept"/>
     <w:p>
       <w:pPr>
         <w:pStyle w:val="Heading2"/>
@@ -2591,7 +2984,7 @@
       <w:pPr>
         <w:numPr>
           <w:ilvl w:val="0"/>
-          <w:numId w:val="1024"/>
+          <w:numId w:val="1025"/>
         </w:numPr>
         <w:pStyle w:val="Compact"/>
       </w:pPr>
@@ -2639,7 +3032,7 @@
       <w:pPr>
         <w:numPr>
           <w:ilvl w:val="0"/>
-          <w:numId w:val="1024"/>
+          <w:numId w:val="1025"/>
         </w:numPr>
         <w:pStyle w:val="Compact"/>
       </w:pPr>
@@ -2666,7 +3059,7 @@
       <w:pPr>
         <w:numPr>
           <w:ilvl w:val="0"/>
-          <w:numId w:val="1024"/>
+          <w:numId w:val="1025"/>
         </w:numPr>
         <w:pStyle w:val="Compact"/>
       </w:pPr>
@@ -2704,8 +3097,8 @@
         <w:t xml:space="preserve">skill on the owner's Claude account.</w:t>
       </w:r>
     </w:p>
-    <w:bookmarkEnd w:id="47"/>
     <w:bookmarkEnd w:id="48"/>
+    <w:bookmarkEnd w:id="49"/>
     <w:sectPr/>
   </w:body>
 </w:document>
@@ -3097,9 +3490,39 @@
     </w:lvlOverride>
   </w:num>
   <w:num w:numId="1023">
+    <w:abstractNumId w:val="99411"/>
+    <w:lvlOverride w:ilvl="0">
+      <w:startOverride w:val="1"/>
+    </w:lvlOverride>
+    <w:lvlOverride w:ilvl="1">
+      <w:startOverride w:val="1"/>
+    </w:lvlOverride>
+    <w:lvlOverride w:ilvl="2">
+      <w:startOverride w:val="1"/>
+    </w:lvlOverride>
+    <w:lvlOverride w:ilvl="3">
+      <w:startOverride w:val="1"/>
+    </w:lvlOverride>
+    <w:lvlOverride w:ilvl="4">
+      <w:startOverride w:val="1"/>
+    </w:lvlOverride>
+    <w:lvlOverride w:ilvl="5">
+      <w:startOverride w:val="1"/>
+    </w:lvlOverride>
+    <w:lvlOverride w:ilvl="6">
+      <w:startOverride w:val="1"/>
+    </w:lvlOverride>
+    <w:lvlOverride w:ilvl="7">
+      <w:startOverride w:val="1"/>
+    </w:lvlOverride>
+    <w:lvlOverride w:ilvl="8">
+      <w:startOverride w:val="1"/>
+    </w:lvlOverride>
+  </w:num>
+  <w:num w:numId="1024">
     <w:abstractNumId w:val="991"/>
   </w:num>
-  <w:num w:numId="1024">
+  <w:num w:numId="1025">
     <w:abstractNumId w:val="991"/>
   </w:num>
 </w:numbering>

</xml_diff>

<commit_message>
docs: fix dollar signs in Word export
Co-Authored-By: Claude Opus 5.5 <noreply@anthropic.com>
Claude-Session: https://claude.ai/code/session_01JPZJaTbXQFN2qiYRf4rkZK
</commit_message>
<xml_diff>
--- a/docs/Next_Owner_Market_Complete_Guide.docx
+++ b/docs/Next_Owner_Market_Complete_Guide.docx
@@ -2715,16 +2715,7 @@
         <w:t xml:space="preserve"> </w:t>
       </w:r>
       <w:r>
-        <w:t xml:space="preserve">every listing shows Buy now from day one, whether or not the seller has finished payout setup. The buyer pays and the money is held as always. When the item is handed over, if the seller hasn't set up payouts, their share stays held and they get an email: "You sold [item].</w:t>
-      </w:r>
-      <w:r>
-        <w:t xml:space="preserve"> </w:t>
-      </w:r>
-      <w:r>
-        <w:t xml:space="preserve">$X is waiting for you." Reminders go out every 3 days with the amount. The moment the seller finishes setup, everything owed is sent to their bank automatically, and the daily job double-checks each morning (automation: "Send held seller money"). Anything held 60+ days alerts staff to decide. New sellers also get payout setup reminders on day 1, 3 and 5 after signing up. The Payouts page shows sellers a green "$</w:t>
-      </w:r>
-      <w:r>
-        <w:t xml:space="preserve">X is waiting for you" box.</w:t>
+        <w:t xml:space="preserve">every listing shows Buy now from day one, whether or not the seller has finished payout setup. The buyer pays and the money is held as always. When the item is handed over, if the seller hasn't set up payouts, their share stays held and they get an email: "You sold [item]. $X is waiting for you." Reminders go out every 3 days with the amount. The moment the seller finishes setup, everything owed is sent to their bank automatically, and the daily job double-checks each morning (automation: "Send held seller money"). Anything held 60+ days alerts staff to decide. New sellers also get payout setup reminders on day 1, 3 and 5 after signing up. The Payouts page shows sellers a green "$X is waiting for you" box.</w:t>
       </w:r>
     </w:p>
     <w:p>

</xml_diff>

<commit_message>
Docs: Write my listing, photo touch-up, lot pricing
Co-Authored-By: Claude Opus 5.5 <noreply@anthropic.com>
Claude-Session: https://claude.ai/code/session_01JPZJaTbXQFN2qiYRf4rkZK
</commit_message>
<xml_diff>
--- a/docs/Next_Owner_Market_Complete_Guide.docx
+++ b/docs/Next_Owner_Market_Complete_Guide.docx
@@ -2,7 +2,7 @@
 <file path=word/document.xml><?xml version="1.0" encoding="utf-8"?>
 <w:document xmlns:w="http://schemas.openxmlformats.org/wordprocessingml/2006/main" xmlns:m="http://schemas.openxmlformats.org/officeDocument/2006/math" xmlns:r="http://schemas.openxmlformats.org/officeDocument/2006/relationships" xmlns:o="urn:schemas-microsoft-com:office:office" xmlns:v="urn:schemas-microsoft-com:vml" xmlns:w10="urn:schemas-microsoft-com:office:word" xmlns:a="http://schemas.openxmlformats.org/drawingml/2006/main" xmlns:pic="http://schemas.openxmlformats.org/drawingml/2006/picture" xmlns:wp="http://schemas.openxmlformats.org/drawingml/2006/wordprocessingDrawing">
   <w:body>
-    <w:bookmarkStart w:id="58" w:name="next-owner-market--the-complete-guide"/>
+    <w:bookmarkStart w:id="59" w:name="next-owner-market--the-complete-guide"/>
     <w:p>
       <w:pPr>
         <w:pStyle w:val="Heading1"/>
@@ -5898,7 +5898,407 @@
       </w:r>
     </w:p>
     <w:bookmarkEnd w:id="57"/>
+    <w:bookmarkStart w:id="58" w:name="Xbc84d8f7e890dbb89c5e47f99fe539123f99b31"/>
+    <w:p>
+      <w:pPr>
+        <w:pStyle w:val="Heading2"/>
+      </w:pPr>
+      <w:r>
+        <w:t xml:space="preserve">Write my listing, photo touch-up, lots (Oct 2, 2026)</w:t>
+      </w:r>
+    </w:p>
+    <w:p>
+      <w:pPr>
+        <w:pStyle w:val="FirstParagraph"/>
+      </w:pPr>
+      <w:r>
+        <w:rPr>
+          <w:bCs/>
+          <w:b/>
+        </w:rPr>
+        <w:t xml:space="preserve">Write my listing:</w:t>
+      </w:r>
+    </w:p>
+    <w:p>
+      <w:pPr>
+        <w:numPr>
+          <w:ilvl w:val="0"/>
+          <w:numId w:val="1036"/>
+        </w:numPr>
+        <w:pStyle w:val="Compact"/>
+      </w:pPr>
+      <w:r>
+        <w:t xml:space="preserve">What's it worth: the button is right under the answer. It creates the draft (title, description, price range, photos, weight, box) and opens</w:t>
+      </w:r>
+      <w:r>
+        <w:t xml:space="preserve"> </w:t>
+      </w:r>
+      <w:r>
+        <w:rPr>
+          <w:rStyle w:val="VerbatimChar"/>
+        </w:rPr>
+        <w:t xml:space="preserve">/app/items/&lt;id&gt;?written=1#copy</w:t>
+      </w:r>
+      <w:r>
+        <w:t xml:space="preserve">.</w:t>
+      </w:r>
+    </w:p>
+    <w:p>
+      <w:pPr>
+        <w:numPr>
+          <w:ilvl w:val="0"/>
+          <w:numId w:val="1036"/>
+        </w:numPr>
+        <w:pStyle w:val="Compact"/>
+      </w:pPr>
+      <w:r>
+        <w:t xml:space="preserve">That page shows "🎉 Your listing is written" and jumps to the copy-and-paste tabs. Facebook is first; eBay, OfferUp, Craigslist, Mercari, Poshmark, Vinted, Depop and Etsy are free for staff and Pro.</w:t>
+      </w:r>
+    </w:p>
+    <w:p>
+      <w:pPr>
+        <w:numPr>
+          <w:ilvl w:val="0"/>
+          <w:numId w:val="1036"/>
+        </w:numPr>
+        <w:pStyle w:val="Compact"/>
+      </w:pPr>
+      <w:r>
+        <w:t xml:space="preserve">Buy or Pass ("I bought it: write my listing") lands on the same page. The draft now gets a description built from the check.</w:t>
+      </w:r>
+    </w:p>
+    <w:p>
+      <w:pPr>
+        <w:numPr>
+          <w:ilvl w:val="0"/>
+          <w:numId w:val="1036"/>
+        </w:numPr>
+        <w:pStyle w:val="Compact"/>
+      </w:pPr>
+      <w:r>
+        <w:t xml:space="preserve">Sort the pile: the button sits at the top. With 1 item it lands on that listing; with more, on Drafts.</w:t>
+      </w:r>
+    </w:p>
+    <w:p>
+      <w:pPr>
+        <w:pStyle w:val="FirstParagraph"/>
+      </w:pPr>
+      <w:r>
+        <w:rPr>
+          <w:bCs/>
+          <w:b/>
+        </w:rPr>
+        <w:t xml:space="preserve">Photo touch-up</w:t>
+      </w:r>
+      <w:r>
+        <w:t xml:space="preserve"> </w:t>
+      </w:r>
+      <w:r>
+        <w:t xml:space="preserve">(</w:t>
+      </w:r>
+      <w:r>
+        <w:rPr>
+          <w:rStyle w:val="VerbatimChar"/>
+        </w:rPr>
+        <w:t xml:space="preserve">src/components/PhotoEditor.tsx</w:t>
+      </w:r>
+      <w:r>
+        <w:t xml:space="preserve">,</w:t>
+      </w:r>
+      <w:r>
+        <w:t xml:space="preserve"> </w:t>
+      </w:r>
+      <w:r>
+        <w:rPr>
+          <w:rStyle w:val="VerbatimChar"/>
+        </w:rPr>
+        <w:t xml:space="preserve">src/lib/photo-edit.ts</w:t>
+      </w:r>
+      <w:r>
+        <w:t xml:space="preserve">):</w:t>
+      </w:r>
+    </w:p>
+    <w:p>
+      <w:pPr>
+        <w:numPr>
+          <w:ilvl w:val="0"/>
+          <w:numId w:val="1037"/>
+        </w:numPr>
+        <w:pStyle w:val="Compact"/>
+      </w:pPr>
+      <w:r>
+        <w:t xml:space="preserve">Runs in the browser. It's free and nothing uploads until Save.</w:t>
+      </w:r>
+    </w:p>
+    <w:p>
+      <w:pPr>
+        <w:numPr>
+          <w:ilvl w:val="0"/>
+          <w:numId w:val="1037"/>
+        </w:numPr>
+        <w:pStyle w:val="Compact"/>
+      </w:pPr>
+      <w:r>
+        <w:rPr>
+          <w:bCs/>
+          <w:b/>
+        </w:rPr>
+        <w:t xml:space="preserve">Dust:</w:t>
+      </w:r>
+      <w:r>
+        <w:t xml:space="preserve"> </w:t>
+      </w:r>
+      <w:r>
+        <w:t xml:space="preserve">a brightness median filter finds marks that differ from the surface. It removes only small blobs whose surroundings are plain surface.</w:t>
+      </w:r>
+    </w:p>
+    <w:p>
+      <w:pPr>
+        <w:numPr>
+          <w:ilvl w:val="0"/>
+          <w:numId w:val="1037"/>
+        </w:numPr>
+        <w:pStyle w:val="Compact"/>
+      </w:pPr>
+      <w:r>
+        <w:rPr>
+          <w:bCs/>
+          <w:b/>
+        </w:rPr>
+        <w:t xml:space="preserve">Lettering guard:</w:t>
+      </w:r>
+      <w:r>
+        <w:t xml:space="preserve"> </w:t>
+      </w:r>
+      <w:r>
+        <w:t xml:space="preserve">a row of similar-height marks side by side counts as text and stays, so model numbers and serials survive. Two passes catch clumps.</w:t>
+      </w:r>
+    </w:p>
+    <w:p>
+      <w:pPr>
+        <w:numPr>
+          <w:ilvl w:val="0"/>
+          <w:numId w:val="1037"/>
+        </w:numPr>
+        <w:pStyle w:val="Compact"/>
+      </w:pPr>
+      <w:r>
+        <w:rPr>
+          <w:bCs/>
+          <w:b/>
+        </w:rPr>
+        <w:t xml:space="preserve">Light:</w:t>
+      </w:r>
+      <w:r>
+        <w:t xml:space="preserve"> </w:t>
+      </w:r>
+      <w:r>
+        <w:t xml:space="preserve">a gentle 65% contrast stretch (never crushes black), a lift for dark photos, and +6% color.</w:t>
+      </w:r>
+    </w:p>
+    <w:p>
+      <w:pPr>
+        <w:numPr>
+          <w:ilvl w:val="0"/>
+          <w:numId w:val="1037"/>
+        </w:numPr>
+        <w:pStyle w:val="Compact"/>
+      </w:pPr>
+      <w:r>
+        <w:rPr>
+          <w:bCs/>
+          <w:b/>
+        </w:rPr>
+        <w:t xml:space="preserve">Tested</w:t>
+      </w:r>
+      <w:r>
+        <w:t xml:space="preserve"> </w:t>
+      </w:r>
+      <w:r>
+        <w:t xml:space="preserve">on a heavy-dust test image (1200×900, two passes in about 0.45 s): about 95% of the specks are removed, and all text plus a small indicator light are intact.</w:t>
+      </w:r>
+    </w:p>
+    <w:p>
+      <w:pPr>
+        <w:numPr>
+          <w:ilvl w:val="0"/>
+          <w:numId w:val="1037"/>
+        </w:numPr>
+        <w:pStyle w:val="Compact"/>
+      </w:pPr>
+      <w:r>
+        <w:rPr>
+          <w:bCs/>
+          <w:b/>
+        </w:rPr>
+        <w:t xml:space="preserve">Where:</w:t>
+      </w:r>
+      <w:r>
+        <w:t xml:space="preserve"> </w:t>
+      </w:r>
+      <w:r>
+        <w:t xml:space="preserve">What's it worth photos, every photo on the item Edit page ("✨ Touch up", plus a "Touch up new photos" checkbox), and Snap mode ("Touch up every photo", on by default).</w:t>
+      </w:r>
+    </w:p>
+    <w:p>
+      <w:pPr>
+        <w:numPr>
+          <w:ilvl w:val="0"/>
+          <w:numId w:val="1037"/>
+        </w:numPr>
+        <w:pStyle w:val="Compact"/>
+      </w:pPr>
+      <w:r>
+        <w:t xml:space="preserve">It doesn't remove caked grime or stains. AI "deep clean" (Gemini image edit, about 3.4¢ a photo, no free tier) is offered but not built without the owner's OK.</w:t>
+      </w:r>
+    </w:p>
+    <w:p>
+      <w:pPr>
+        <w:pStyle w:val="FirstParagraph"/>
+      </w:pPr>
+      <w:r>
+        <w:rPr>
+          <w:bCs/>
+          <w:b/>
+        </w:rPr>
+        <w:t xml:space="preserve">Lots</w:t>
+      </w:r>
+      <w:r>
+        <w:t xml:space="preserve"> </w:t>
+      </w:r>
+      <w:r>
+        <w:t xml:space="preserve">(</w:t>
+      </w:r>
+      <w:r>
+        <w:rPr>
+          <w:rStyle w:val="VerbatimChar"/>
+        </w:rPr>
+        <w:t xml:space="preserve">/api/worth</w:t>
+      </w:r>
+      <w:r>
+        <w:t xml:space="preserve">):</w:t>
+      </w:r>
+    </w:p>
+    <w:p>
+      <w:pPr>
+        <w:numPr>
+          <w:ilvl w:val="0"/>
+          <w:numId w:val="1038"/>
+        </w:numPr>
+        <w:pStyle w:val="Compact"/>
+      </w:pPr>
+      <w:r>
+        <w:t xml:space="preserve">The AI returns</w:t>
+      </w:r>
+      <w:r>
+        <w:t xml:space="preserve"> </w:t>
+      </w:r>
+      <w:r>
+        <w:rPr>
+          <w:rStyle w:val="VerbatimChar"/>
+        </w:rPr>
+        <w:t xml:space="preserve">pieces[]</w:t>
+      </w:r>
+      <w:r>
+        <w:t xml:space="preserve"> </w:t>
+      </w:r>
+      <w:r>
+        <w:t xml:space="preserve">(name, qty, value each, note, listing_title, listing_description) and</w:t>
+      </w:r>
+      <w:r>
+        <w:t xml:space="preserve"> </w:t>
+      </w:r>
+      <w:r>
+        <w:rPr>
+          <w:rStyle w:val="VerbatimChar"/>
+        </w:rPr>
+        <w:t xml:space="preserve">sell_advice</w:t>
+      </w:r>
+      <w:r>
+        <w:t xml:space="preserve"> </w:t>
+      </w:r>
+      <w:r>
+        <w:t xml:space="preserve">when the photos show 2 or more separate items.</w:t>
+      </w:r>
+      <w:r>
+        <w:t xml:space="preserve"> </w:t>
+      </w:r>
+      <w:r>
+        <w:rPr>
+          <w:rStyle w:val="VerbatimChar"/>
+        </w:rPr>
+        <w:t xml:space="preserve">value_low/high</w:t>
+      </w:r>
+      <w:r>
+        <w:t xml:space="preserve"> </w:t>
+      </w:r>
+      <w:r>
+        <w:t xml:space="preserve">and</w:t>
+      </w:r>
+      <w:r>
+        <w:t xml:space="preserve"> </w:t>
+      </w:r>
+      <w:r>
+        <w:rPr>
+          <w:rStyle w:val="VerbatimChar"/>
+        </w:rPr>
+        <w:t xml:space="preserve">listing</w:t>
+      </w:r>
+      <w:r>
+        <w:t xml:space="preserve"> </w:t>
+      </w:r>
+      <w:r>
+        <w:t xml:space="preserve">are then the whole-lot price.</w:t>
+      </w:r>
+    </w:p>
+    <w:p>
+      <w:pPr>
+        <w:numPr>
+          <w:ilvl w:val="0"/>
+          <w:numId w:val="1038"/>
+        </w:numPr>
+        <w:pStyle w:val="Compact"/>
+      </w:pPr>
+      <w:r>
+        <w:t xml:space="preserve">The page shows "All N together, sold as one lot," "Sold one at a time" (the total), and each piece with "List this one by itself."</w:t>
+      </w:r>
+    </w:p>
+    <w:p>
+      <w:pPr>
+        <w:numPr>
+          <w:ilvl w:val="0"/>
+          <w:numId w:val="1038"/>
+        </w:numPr>
+        <w:pStyle w:val="Compact"/>
+      </w:pPr>
+      <w:r>
+        <w:t xml:space="preserve">max_tokens is 5000 and maxDuration 120 s.</w:t>
+      </w:r>
+    </w:p>
+    <w:p>
+      <w:pPr>
+        <w:numPr>
+          <w:ilvl w:val="0"/>
+          <w:numId w:val="1038"/>
+        </w:numPr>
+        <w:pStyle w:val="Compact"/>
+      </w:pPr>
+      <w:r>
+        <w:rPr>
+          <w:bCs/>
+          <w:b/>
+        </w:rPr>
+        <w:t xml:space="preserve">Test:</w:t>
+      </w:r>
+      <w:r>
+        <w:t xml:space="preserve"> </w:t>
+      </w:r>
+      <w:r>
+        <w:t xml:space="preserve">the owner's photo of 6 satellite receivers took 20 s. Lot $120–400; pieces $20–120 each, with the Drake ESR 1224 the most valuable. Advice: pull out the Drake and the Chaparral for eBay, and sell the rest locally as a lot.</w:t>
+      </w:r>
+    </w:p>
     <w:bookmarkEnd w:id="58"/>
+    <w:bookmarkEnd w:id="59"/>
     <w:sectPr/>
   </w:body>
 </w:document>
@@ -6465,6 +6865,15 @@
     <w:abstractNumId w:val="991"/>
   </w:num>
   <w:num w:numId="1035">
+    <w:abstractNumId w:val="991"/>
+  </w:num>
+  <w:num w:numId="1036">
+    <w:abstractNumId w:val="991"/>
+  </w:num>
+  <w:num w:numId="1037">
+    <w:abstractNumId w:val="991"/>
+  </w:num>
+  <w:num w:numId="1038">
     <w:abstractNumId w:val="991"/>
   </w:num>
 </w:numbering>

</xml_diff>